<commit_message>
chore(samples): add ZenCover input docs, drop legacy HTML samples
Add the ZenCover Word inputs (welcome letter, policy summary, cancellation
notice) used to exercise the Leg 0 docx flow; remove the stale standalone
HTML samples superseded by them.

Co-Authored-By: Claude Fable 5 <noreply@anthropic.com>
</commit_message>
<xml_diff>
--- a/samples/input/ZenCoverTest(quote).docx
+++ b/samples/input/ZenCoverTest(quote).docx
@@ -57,11 +57,6 @@
         <w:t xml:space="preserve">:  </w:t>
       </w:r>
       <w:r>
-        <w:rPr>
-          <w:b/>
-          <w:bCs/>
-          <w:color w:val="00FF00"/>
-        </w:rPr>
         <w:t>{</w:t>
       </w:r>
       <w:proofErr w:type="gramEnd"/>
@@ -71,7 +66,7 @@
           <w:bCs/>
           <w:color w:val="00FF00"/>
         </w:rPr>
-        <w:t>$</w:t>
+        <w:t>account.</w:t>
       </w:r>
       <w:proofErr w:type="gramStart"/>
       <w:r>
@@ -80,7 +75,7 @@
           <w:bCs/>
           <w:color w:val="00FF00"/>
         </w:rPr>
-        <w:t>data.account</w:t>
+        <w:t>data.firstName</w:t>
       </w:r>
       <w:proofErr w:type="gramEnd"/>
       <w:r>
@@ -89,24 +84,6 @@
           <w:bCs/>
           <w:color w:val="00FF00"/>
         </w:rPr>
-        <w:t>.</w:t>
-      </w:r>
-      <w:proofErr w:type="gramStart"/>
-      <w:r>
-        <w:rPr>
-          <w:b/>
-          <w:bCs/>
-          <w:color w:val="00FF00"/>
-        </w:rPr>
-        <w:t>data.firstName</w:t>
-      </w:r>
-      <w:proofErr w:type="gramEnd"/>
-      <w:r>
-        <w:rPr>
-          <w:b/>
-          <w:bCs/>
-          <w:color w:val="00FF00"/>
-        </w:rPr>
         <w:t>} {</w:t>
       </w:r>
       <w:r>
@@ -115,33 +92,7 @@
           <w:bCs/>
           <w:color w:val="00FF00"/>
         </w:rPr>
-        <w:t>$</w:t>
-      </w:r>
-      <w:proofErr w:type="gramStart"/>
-      <w:r>
-        <w:rPr>
-          <w:b/>
-          <w:bCs/>
-          <w:color w:val="00FF00"/>
-        </w:rPr>
-        <w:t>data.</w:t>
-      </w:r>
-      <w:r>
-        <w:rPr>
-          <w:b/>
-          <w:bCs/>
-          <w:color w:val="00FF00"/>
-        </w:rPr>
-        <w:t>account</w:t>
-      </w:r>
-      <w:proofErr w:type="gramEnd"/>
-      <w:r>
-        <w:rPr>
-          <w:b/>
-          <w:bCs/>
-          <w:color w:val="00FF00"/>
-        </w:rPr>
-        <w:t>.</w:t>
+        <w:t>account.</w:t>
       </w:r>
       <w:proofErr w:type="gramStart"/>
       <w:r>
@@ -183,30 +134,22 @@
         <w:spacing w:after="120"/>
       </w:pPr>
       <w:r>
-        <w:t>Quote</w:t>
-      </w:r>
-      <w:r>
-        <w:t xml:space="preserve"> Number</w:t>
+        <w:t>Quote Number</w:t>
       </w:r>
       <w:proofErr w:type="gramStart"/>
       <w:r>
         <w:t xml:space="preserve">:  </w:t>
       </w:r>
       <w:r>
-        <w:rPr>
-          <w:b/>
-          <w:bCs/>
-          <w:color w:val="00FF00"/>
-        </w:rPr>
         <w:t>{</w:t>
       </w:r>
-      <w:proofErr w:type="gramEnd"/>
-      <w:r>
-        <w:t>$</w:t>
-      </w:r>
-      <w:proofErr w:type="gramStart"/>
-      <w:r>
-        <w:t>data.quoteNumber</w:t>
+      <w:r>
+        <w:rPr>
+          <w:b/>
+          <w:bCs/>
+          <w:color w:val="00FF00"/>
+        </w:rPr>
+        <w:t>quote.quoteNumber</w:t>
       </w:r>
       <w:proofErr w:type="gramEnd"/>
       <w:r>
@@ -298,7 +241,6 @@
       <w:r>
         <w:t>as of the Policy Effective Date shown in the Policy’s Master Application</w:t>
       </w:r>
-      <w:proofErr w:type="gramStart"/>
       <w:r>
         <w:rPr>
           <w:b/>
@@ -313,9 +255,24 @@
           <w:bCs/>
           <w:color w:val="00FF00"/>
         </w:rPr>
-        <w:t>][</w:t>
-      </w:r>
-      <w:proofErr w:type="gramEnd"/>
+        <w:t>]</w:t>
+      </w:r>
+      <w:r>
+        <w:rPr>
+          <w:b/>
+          <w:bCs/>
+          <w:color w:val="00FF00"/>
+        </w:rPr>
+        <w:t xml:space="preserve"> </w:t>
+      </w:r>
+      <w:r>
+        <w:rPr>
+          <w:b/>
+          <w:bCs/>
+          <w:color w:val="00FF00"/>
+        </w:rPr>
+        <w:t>[</w:t>
+      </w:r>
       <w:r>
         <w:rPr>
           <w:b/>

</xml_diff>